<commit_message>
Release v1.0.0 - Complete Career Operating System
</commit_message>
<xml_diff>
--- a/exports/docx/Anthony_Essel_Prepeh_Cover_Letter.docx
+++ b/exports/docx/Anthony_Essel_Prepeh_Cover_Letter.docx
@@ -38,29 +38,11 @@
     <w:p/>
     <w:p/>
     <w:p>
-      <w:pPr>
-        <w:pStyle w:val="Heading1"/>
-      </w:pPr>
       <w:r>
         <w:rPr>
           <w:rFonts w:ascii="Calibri" w:hAnsi="Calibri" w:eastAsia="Calibri"/>
-          <w:b/>
-          <w:color w:val="0A3D62"/>
-          <w:sz w:val="32"/>
-        </w:rPr>
-        <w:t>COVER LETTER</w:t>
-      </w:r>
-    </w:p>
-    <w:p>
-      <w:pPr>
-        <w:pStyle w:val="Heading2"/>
-      </w:pPr>
-      <w:r>
-        <w:rPr>
-          <w:rFonts w:ascii="Calibri" w:hAnsi="Calibri" w:eastAsia="Calibri"/>
-          <w:b/>
-          <w:color w:val="0A3D62"/>
-          <w:sz w:val="28"/>
+          <w:color w:val="282828"/>
+          <w:sz w:val="22"/>
         </w:rPr>
         <w:t>Anthony Essel Prepeh</w:t>
       </w:r>
@@ -72,7 +54,7 @@
           <w:color w:val="282828"/>
           <w:sz w:val="22"/>
         </w:rPr>
-        <w:t>Obuasi, Ashanti Region, Ghana</w:t>
+        <w:t>Kumasi, Ashanti Region, Ghana</w:t>
       </w:r>
     </w:p>
     <w:p>
@@ -82,7 +64,7 @@
           <w:color w:val="282828"/>
           <w:sz w:val="22"/>
         </w:rPr>
-        <w:t>+233 24 259 2148</w:t>
+        <w:t>Email: anthonyesselprepeh@gmail.com</w:t>
       </w:r>
     </w:p>
     <w:p>
@@ -92,7 +74,17 @@
           <w:color w:val="282828"/>
           <w:sz w:val="22"/>
         </w:rPr>
-        <w:t>anthonyesselprepehanthony@gmail.com</w:t>
+        <w:t>Phone: +233 24 259 2148</w:t>
+      </w:r>
+    </w:p>
+    <w:p>
+      <w:r>
+        <w:rPr>
+          <w:rFonts w:ascii="Calibri" w:hAnsi="Calibri" w:eastAsia="Calibri"/>
+          <w:color w:val="282828"/>
+          <w:sz w:val="22"/>
+        </w:rPr>
+        <w:t>LinkedIn: https://www.linkedin.com/in/anthony-essel-prepeh</w:t>
       </w:r>
     </w:p>
     <w:p>
@@ -112,7 +104,7 @@
           <w:color w:val="282828"/>
           <w:sz w:val="22"/>
         </w:rPr>
-        <w:t>LinkedIn: https://www.linkedin.com/in/anthony-prempeh-548325277</w:t>
+        <w:t>12 July 2026</w:t>
       </w:r>
     </w:p>
     <w:p>
@@ -135,63 +127,84 @@
           <w:color w:val="282828"/>
           <w:sz w:val="22"/>
         </w:rPr>
-        <w:t xml:space="preserve">Date: </w:t>
+        <w:t>Hiring Manager</w:t>
+      </w:r>
+    </w:p>
+    <w:p>
+      <w:r>
+        <w:rPr>
+          <w:rFonts w:ascii="Calibri" w:hAnsi="Calibri" w:eastAsia="Calibri"/>
+          <w:color w:val="282828"/>
+          <w:sz w:val="22"/>
+        </w:rPr>
+        <w:t>AngloGold Ashanti (Ghana) Limited</w:t>
+      </w:r>
+    </w:p>
+    <w:p>
+      <w:r>
+        <w:rPr>
+          <w:rFonts w:ascii="Calibri" w:hAnsi="Calibri" w:eastAsia="Calibri"/>
+          <w:color w:val="282828"/>
+          <w:sz w:val="22"/>
+        </w:rPr>
+        <w:t>Gold House</w:t>
+      </w:r>
+    </w:p>
+    <w:p>
+      <w:r>
+        <w:rPr>
+          <w:rFonts w:ascii="Calibri" w:hAnsi="Calibri" w:eastAsia="Calibri"/>
+          <w:color w:val="282828"/>
+          <w:sz w:val="22"/>
+        </w:rPr>
+        <w:t>Patrice Lumumba Road</w:t>
+      </w:r>
+    </w:p>
+    <w:p>
+      <w:r>
+        <w:rPr>
+          <w:rFonts w:ascii="Calibri" w:hAnsi="Calibri" w:eastAsia="Calibri"/>
+          <w:color w:val="282828"/>
+          <w:sz w:val="22"/>
+        </w:rPr>
+        <w:t>P.O. Box 2665</w:t>
+      </w:r>
+    </w:p>
+    <w:p>
+      <w:r>
+        <w:rPr>
+          <w:rFonts w:ascii="Calibri" w:hAnsi="Calibri" w:eastAsia="Calibri"/>
+          <w:color w:val="282828"/>
+          <w:sz w:val="22"/>
+        </w:rPr>
+        <w:t>Accra, Ghana</w:t>
       </w:r>
     </w:p>
     <w:p>
       <w:pPr>
-        <w:pStyle w:val="Heading2"/>
+        <w:jc w:val="center"/>
+      </w:pPr>
+      <w:r>
+        <w:rPr>
+          <w:rFonts w:ascii="Calibri" w:hAnsi="Calibri" w:eastAsia="Calibri"/>
+          <w:color w:val="B8860B"/>
+          <w:sz w:val="20"/>
+        </w:rPr>
+        <w:t>────────────────────────────────────────</w:t>
+      </w:r>
+    </w:p>
+    <w:p>
+      <w:pPr>
+        <w:pStyle w:val="Heading1"/>
       </w:pPr>
       <w:r>
         <w:rPr>
           <w:rFonts w:ascii="Calibri" w:hAnsi="Calibri" w:eastAsia="Calibri"/>
           <w:b/>
           <w:color w:val="0A3D62"/>
-          <w:sz w:val="28"/>
+          <w:sz w:val="32"/>
         </w:rPr>
-        <w:t>Hiring Manager</w:t>
-      </w:r>
-    </w:p>
-    <w:p>
-      <w:pPr>
-        <w:pStyle w:val="Heading2"/>
-      </w:pPr>
-      <w:r>
-        <w:rPr>
-          <w:rFonts w:ascii="Calibri" w:hAnsi="Calibri" w:eastAsia="Calibri"/>
-          <w:b/>
-          <w:color w:val="0A3D62"/>
-          <w:sz w:val="28"/>
-        </w:rPr>
-        <w:t>[Company Name]</w:t>
-      </w:r>
-    </w:p>
-    <w:p>
-      <w:pPr>
-        <w:pStyle w:val="Heading2"/>
-      </w:pPr>
-      <w:r>
-        <w:rPr>
-          <w:rFonts w:ascii="Calibri" w:hAnsi="Calibri" w:eastAsia="Calibri"/>
-          <w:b/>
-          <w:color w:val="0A3D62"/>
-          <w:sz w:val="28"/>
-        </w:rPr>
-        <w:t>[Company Address]</w:t>
-      </w:r>
-    </w:p>
-    <w:p>
-      <w:pPr>
-        <w:pStyle w:val="Heading3"/>
-      </w:pPr>
-      <w:r>
-        <w:rPr>
-          <w:rFonts w:ascii="Calibri" w:hAnsi="Calibri" w:eastAsia="Calibri"/>
-          <w:b/>
-          <w:color w:val="0A3D62"/>
-          <w:sz w:val="24"/>
-        </w:rPr>
-        <w:t>Subject: Application for the Position of [Graduate Geological Engineer / National Service Personnel / Graduate Trainee]</w:t>
+        <w:t>Application for National Service Placement</w:t>
       </w:r>
     </w:p>
     <w:p>
@@ -211,7 +224,7 @@
           <w:color w:val="282828"/>
           <w:sz w:val="22"/>
         </w:rPr>
-        <w:t>I am writing to express my interest in the [Position] at [Company Name]. I am a final-year Bachelor of Science (BSc) Geological Engineering student at the Kwame Nkrumah University of Science and Technology (KNUST) with a strong passion for mineral exploration, engineering geology, hydrogeology, geotechnical engineering, mining technology, and the application of modern digital technologies to solve engineering challenges.</w:t>
+        <w:t>I am writing to express my sincere interest in the National Service Placement opportunity with AngloGold Ashanti (Ghana) Limited. I am currently a final-year Bachelor of Science (BSc) Geological Engineering student at Kwame Nkrumah University of Science and Technology (KNUST) and expect to graduate in November 2026.</w:t>
       </w:r>
     </w:p>
     <w:p>
@@ -221,7 +234,7 @@
           <w:color w:val="282828"/>
           <w:sz w:val="22"/>
         </w:rPr>
-        <w:t>Throughout my academic journey, I have developed practical knowledge in geological mapping, engineering geology, mineral exploration, hydrogeology, groundwater development, engineering data interpretation, exploration geochemistry, exploration geophysics, and technical report writing. These experiences have strengthened my analytical thinking, problem-solving abilities, and commitment to delivering high-quality technical work.</w:t>
+        <w:t>My academic training has provided me with a solid foundation in engineering geology, mineral exploration, hydrogeology, geotechnical engineering, geological mapping, geographic information systems (GIS), remote sensing, engineering design, and geological data interpretation. Through fieldwork, laboratory practicals, technical reports, and engineering projects, I have developed strong analytical, problem-solving, and communication skills.</w:t>
       </w:r>
     </w:p>
     <w:p>
@@ -231,7 +244,7 @@
           <w:color w:val="282828"/>
           <w:sz w:val="22"/>
         </w:rPr>
-        <w:t>In addition to my engineering education, I have intentionally developed strong digital and technical skills that complement modern geological practice. I have experience using Python, Git, GitHub, HTML, CSS, Markdown, and Visual Studio Code to automate workflows, organize technical information, and improve productivity. I am also expanding my proficiency in ArcGIS Pro, QGIS, and Leapfrog Geo to support geological modelling, spatial analysis, and resource evaluation.</w:t>
+        <w:t>Alongside my academic work, I have undertaken independent technical projects that demonstrate my commitment to continuous learning and innovation. These include orebody modelling and resource evaluation, groundwater quality analysis, and the development of an automated Career Operating System that generates professional portfolios, résumés, and supporting career documents using Python, Markdown, YAML, HTML, and CSS. These projects have strengthened both my engineering knowledge and my software development skills.</w:t>
       </w:r>
     </w:p>
     <w:p>
@@ -241,7 +254,7 @@
           <w:color w:val="282828"/>
           <w:sz w:val="22"/>
         </w:rPr>
-        <w:t>One of my most significant personal initiatives has been the development of a Career Operating System, a Python-powered platform that automatically generates professional documentation, portfolio websites, résumés, and technical reports from structured data. This project demonstrates my commitment to continuous learning, innovation, automation, and applying technology to improve engineering workflows.</w:t>
+        <w:t>I am particularly interested in joining AngloGold Ashanti because of the company's reputation for operational excellence, responsible mining, innovation, environmental stewardship, and investment in developing young professionals. I am eager to contribute my knowledge while learning from experienced engineers and geoscientists within your organisation during my National Service.</w:t>
       </w:r>
     </w:p>
     <w:p>
@@ -251,7 +264,7 @@
           <w:color w:val="282828"/>
           <w:sz w:val="22"/>
         </w:rPr>
-        <w:t>I am particularly interested in joining [Company Name] because of its reputation for engineering excellence, operational integrity, commitment to safety, and investment in developing young professionals. I am confident that my willingness to learn, strong work ethic, technical foundation, and adaptability will enable me to contribute positively to your team while continuing to grow under the guidance of experienced engineers and geoscientists.</w:t>
+        <w:t>I am a hardworking, adaptable, and safety-conscious individual who works well both independently and as part of a multidisciplinary team. I am confident that my academic background, technical skills, and enthusiasm for geological engineering will allow me to make a positive contribution to AngloGold Ashanti while gaining valuable professional experience.</w:t>
       </w:r>
     </w:p>
     <w:p>
@@ -261,7 +274,7 @@
           <w:color w:val="282828"/>
           <w:sz w:val="22"/>
         </w:rPr>
-        <w:t>I welcome the opportunity to discuss how my academic background, technical skills, and enthusiasm for Geological Engineering can contribute to the continued success of your organization. Thank you for taking the time to consider my application. I look forward to the opportunity to speak with you.</w:t>
+        <w:t>I would be honoured to be considered for a National Service placement with AngloGold Ashanti (Ghana) Limited. Thank you for considering my application. I would welcome the opportunity to discuss how my qualifications and enthusiasm align with your organisation's goals.</w:t>
       </w:r>
     </w:p>
     <w:p>
@@ -275,15 +288,11 @@
       </w:r>
     </w:p>
     <w:p>
-      <w:pPr>
-        <w:pStyle w:val="Heading2"/>
-      </w:pPr>
       <w:r>
         <w:rPr>
           <w:rFonts w:ascii="Calibri" w:hAnsi="Calibri" w:eastAsia="Calibri"/>
-          <w:b/>
-          <w:color w:val="0A3D62"/>
-          <w:sz w:val="28"/>
+          <w:color w:val="282828"/>
+          <w:sz w:val="22"/>
         </w:rPr>
         <w:t>Anthony Essel Prepeh</w:t>
       </w:r>

</xml_diff>